<commit_message>
feat: Implement Global Timesheet Upload Solution (Intelligent Resolver & Navigation Standardization)
</commit_message>
<xml_diff>
--- a/agent_missions/MODULE_33_THE_PITCH/AgileCare_Pitch_Prep_March17_v2.docx
+++ b/agent_missions/MODULE_33_THE_PITCH/AgileCare_Pitch_Prep_March17_v2.docx
@@ -2350,7 +2350,7 @@
           <w:sz w:val="22"/>
           <w:szCs w:val="22"/>
         </w:rPr>
-        <w:t xml:space="preserve">We are live with Dominion Healthcare Services in Stockton-on-Tees since December 2025. 45 healthcare professionals onboarded, over 200 shifts processed autonomously, and an 80% reduction in administrative time. Their Operations Director said — and I'll quote directly — 'Before ACG StaffLink, we spent hours calling staff. Now shifts fill themselves in minutes. It's transformed our operations.'</w:t>
+        <w:t xml:space="preserve">We are live with Dominion Healthcare Services in Stockton-on-Tees since December 2025. 45 healthcare professionals onboarded, over 200 shifts processed autonomously, and an 80% reduction in administrative time. Their Operations Director said — and I'll quote directly — 'Before ACG StaffLink, we spent hours calling staff. Now shifts fill themselves in minutes. It has transformed our operations.'</w:t>
       </w:r>
     </w:p>
     <w:p>
@@ -2450,7 +2450,7 @@
           <w:sz w:val="22"/>
           <w:szCs w:val="22"/>
         </w:rPr>
-        <w:t xml:space="preserve">I'm raising £60,000 in SEIS-eligible equity — effective cost to a UK taxpayer after 50% income tax relief is just £30,000 — for 10 to 15% at a £350k to £500k pre-money valuation. I am not looking to close a deal today. I'm looking for the right conversations. If you understand B2B SaaS, if you know healthcare, or if you're drawn to first-mover opportunities in a massively underserved market — I'd love five minutes with you after this.</w:t>
+        <w:t xml:space="preserve">I'm raising £60,000 in SEIS-eligible equity, for 10 to 15% at a £350k to £500k pre-money valuation. For a UK taxpayer, the 50% income tax relief brings the effective cost to just £30,000. I am not looking to close a deal today. I'm looking for the right conversations. If you understand B2B SaaS, if you know healthcare, or if you're drawn to first-mover opportunities in a massively underserved market — I'd love five minutes with you after this.</w:t>
       </w:r>
     </w:p>
     <w:p>
@@ -2793,7 +2793,7 @@
           <w:sz w:val="22"/>
           <w:szCs w:val="22"/>
         </w:rPr>
-        <w:t xml:space="preserve">Kylie AI is our conversational agent that lives inside WhatsApp. When a shift is posted, Kylie broadcasts it intelligently — smart routing prioritises preferred staff and highest reliability scores first. First qualified response books the shift instantly. Rota updates in real time. GPS geofencing verifies attendance. If someone cancels, Kylie reposts and backfills automatically — self-healing shifts.</w:t>
+        <w:t xml:space="preserve">Kylie AI is our conversational agent that lives inside WhatsApp. When a shift is posted, Kylie broadcasts it intelligently — smart routing prioritises your best-rated, most reliable staff first. First qualified response books the shift instantly. Rota updates in real time. GPS geofencing verifies attendance. If someone cancels, Kylie reposts and backfills automatically — self-healing shifts.</w:t>
       </w:r>
     </w:p>
     <w:p>
@@ -2843,7 +2843,7 @@
           <w:sz w:val="22"/>
           <w:szCs w:val="22"/>
         </w:rPr>
-        <w:t xml:space="preserve">Shift fill time drops from 4-plus hours to 15 minutes. Match accuracy is 99.8%. An agency that previously needed multiple coordinators for scheduling can now operate with one — or none.</w:t>
+        <w:t xml:space="preserve">Shift fill time drops from 4-plus hours to 15 minutes. Match accuracy is 99.8%. An agency that previously had coordinators buried in shift-chasing admin now has those same people free to focus on client relationships and growing the business.</w:t>
       </w:r>
     </w:p>
     <w:p>

</xml_diff>